<commit_message>
Add Gemini CV enhancement integration
</commit_message>
<xml_diff>
--- a/templates/base_cv.docx
+++ b/templates/base_cv.docx
@@ -213,13 +213,17 @@
           <w:rFonts w:ascii="Calibri" w:cs="Calibri" w:eastAsia="Calibri" w:hAnsi="Calibri"/>
           <w:b w:val="1"/>
           <w:bCs w:val="1"/>
-        </w:rPr>
-      </w:pPr>
-      <w:r>
-        <w:rPr>
-          <w:rFonts w:ascii="Calibri" w:cs="Calibri" w:eastAsia="Calibri" w:hAnsi="Calibri"/>
-          <w:b w:val="1"/>
-          <w:bCs w:val="1"/>
+          <w:sz w:val="20"/>
+          <w:szCs w:val="20"/>
+        </w:rPr>
+      </w:pPr>
+      <w:r>
+        <w:rPr>
+          <w:rFonts w:ascii="Calibri" w:cs="Calibri" w:eastAsia="Calibri" w:hAnsi="Calibri"/>
+          <w:b w:val="1"/>
+          <w:bCs w:val="1"/>
+          <w:sz w:val="20"/>
+          <w:szCs w:val="20"/>
           <w:rtl w:val="0"/>
         </w:rPr>
         <w:t xml:space="preserve">École Supérieure de Publicité ( ESP ) </w:t>
@@ -227,6 +231,8 @@
       <w:r>
         <w:rPr>
           <w:rFonts w:ascii="Calibri" w:cs="Calibri" w:eastAsia="Calibri" w:hAnsi="Calibri"/>
+          <w:sz w:val="20"/>
+          <w:szCs w:val="20"/>
           <w:rtl w:val="0"/>
         </w:rPr>
         <w:t xml:space="preserve">– Paris 16</w:t>
@@ -236,6 +242,8 @@
           <w:rFonts w:ascii="Calibri" w:cs="Calibri" w:eastAsia="Calibri" w:hAnsi="Calibri"/>
           <w:b w:val="1"/>
           <w:bCs w:val="1"/>
+          <w:sz w:val="20"/>
+          <w:szCs w:val="20"/>
           <w:rtl w:val="0"/>
         </w:rPr>
         <w:tab/>
@@ -257,11 +265,15 @@
         <w:ind w:left="180" w:right="118" w:firstLine="0"/>
         <w:rPr>
           <w:rFonts w:ascii="Calibri" w:cs="Calibri" w:eastAsia="Calibri" w:hAnsi="Calibri"/>
-        </w:rPr>
-      </w:pPr>
-      <w:r>
-        <w:rPr>
-          <w:rFonts w:ascii="Calibri" w:cs="Calibri" w:eastAsia="Calibri" w:hAnsi="Calibri"/>
+          <w:sz w:val="20"/>
+          <w:szCs w:val="20"/>
+        </w:rPr>
+      </w:pPr>
+      <w:r>
+        <w:rPr>
+          <w:rFonts w:ascii="Calibri" w:cs="Calibri" w:eastAsia="Calibri" w:hAnsi="Calibri"/>
+          <w:sz w:val="20"/>
+          <w:szCs w:val="20"/>
           <w:rtl w:val="0"/>
         </w:rPr>
         <w:t xml:space="preserve">Bachelor III - Chef de Projet </w:t>
@@ -270,6 +282,8 @@
         <w:rPr>
           <w:rFonts w:ascii="Calibri" w:cs="Calibri" w:eastAsia="Calibri" w:hAnsi="Calibri"/>
           <w:color w:val="000000"/>
+          <w:sz w:val="20"/>
+          <w:szCs w:val="20"/>
           <w:rtl w:val="0"/>
         </w:rPr>
         <w:t xml:space="preserve"> - Graduation Oct.</w:t>
@@ -277,6 +291,8 @@
       <w:r>
         <w:rPr>
           <w:rFonts w:ascii="Calibri" w:cs="Calibri" w:eastAsia="Calibri" w:hAnsi="Calibri"/>
+          <w:sz w:val="20"/>
+          <w:szCs w:val="20"/>
           <w:rtl w:val="0"/>
         </w:rPr>
         <w:t xml:space="preserve">2025</w:t>
@@ -285,6 +301,8 @@
         <w:rPr>
           <w:rFonts w:ascii="Calibri" w:cs="Calibri" w:eastAsia="Calibri" w:hAnsi="Calibri"/>
           <w:color w:val="000000"/>
+          <w:sz w:val="20"/>
+          <w:szCs w:val="20"/>
           <w:rtl w:val="0"/>
         </w:rPr>
         <w:t xml:space="preserve"> </w:t>
@@ -292,6 +310,8 @@
       <w:r>
         <w:rPr>
           <w:rFonts w:ascii="Calibri" w:cs="Calibri" w:eastAsia="Calibri" w:hAnsi="Calibri"/>
+          <w:sz w:val="20"/>
+          <w:szCs w:val="20"/>
           <w:rtl w:val="0"/>
         </w:rPr>
         <w:br w:type="textWrapping"/>
@@ -307,13 +327,17 @@
           <w:rFonts w:ascii="Calibri" w:cs="Calibri" w:eastAsia="Calibri" w:hAnsi="Calibri"/>
           <w:b w:val="1"/>
           <w:bCs w:val="1"/>
-        </w:rPr>
-      </w:pPr>
-      <w:r>
-        <w:rPr>
-          <w:rFonts w:ascii="Calibri" w:cs="Calibri" w:eastAsia="Calibri" w:hAnsi="Calibri"/>
-          <w:b w:val="1"/>
-          <w:bCs w:val="1"/>
+          <w:sz w:val="20"/>
+          <w:szCs w:val="20"/>
+        </w:rPr>
+      </w:pPr>
+      <w:r>
+        <w:rPr>
+          <w:rFonts w:ascii="Calibri" w:cs="Calibri" w:eastAsia="Calibri" w:hAnsi="Calibri"/>
+          <w:b w:val="1"/>
+          <w:bCs w:val="1"/>
+          <w:sz w:val="20"/>
+          <w:szCs w:val="20"/>
           <w:rtl w:val="0"/>
         </w:rPr>
         <w:t xml:space="preserve">Certifications</w:t>
@@ -334,6 +358,8 @@
           <w:rFonts w:ascii="Calibri" w:cs="Calibri" w:eastAsia="Calibri" w:hAnsi="Calibri"/>
           <w:b w:val="1"/>
           <w:bCs w:val="1"/>
+          <w:sz w:val="20"/>
+          <w:szCs w:val="20"/>
           <w:rtl w:val="0"/>
         </w:rPr>
         <w:t xml:space="preserve">[[CERTIFICATION_ENTRIES]]</w:t>
@@ -448,7 +474,7 @@
           <w:rFonts w:ascii="Calibri" w:cs="Calibri" w:eastAsia="Calibri" w:hAnsi="Calibri"/>
           <w:rtl w:val="0"/>
         </w:rPr>
-        <w:t xml:space="preserve">Experiences</w:t>
+        <w:t xml:space="preserve">Expériences</w:t>
       </w:r>
       <w:r>
         <w:rPr>
@@ -499,6 +525,8 @@
           <w:rFonts w:ascii="Calibri" w:cs="Calibri" w:eastAsia="Calibri" w:hAnsi="Calibri"/>
           <w:b w:val="1"/>
           <w:bCs w:val="1"/>
+          <w:sz w:val="20"/>
+          <w:szCs w:val="20"/>
         </w:rPr>
       </w:pPr>
       <w:r>
@@ -510,12 +538,27 @@
           <w:highlight w:val="white"/>
           <w:rtl w:val="0"/>
         </w:rPr>
-        <w:t xml:space="preserve">    </w:t>
-      </w:r>
-      <w:r>
-        <w:rPr>
-          <w:rFonts w:ascii="Calibri" w:cs="Calibri" w:eastAsia="Calibri" w:hAnsi="Calibri"/>
+        <w:t xml:space="preserve">   </w:t>
+      </w:r>
+      <w:r>
+        <w:rPr>
+          <w:rFonts w:ascii="Calibri" w:cs="Calibri" w:eastAsia="Calibri" w:hAnsi="Calibri"/>
+          <w:b w:val="1"/>
+          <w:bCs w:val="1"/>
           <w:color w:val="242424"/>
+          <w:sz w:val="20"/>
+          <w:szCs w:val="20"/>
+          <w:highlight w:val="white"/>
+          <w:rtl w:val="0"/>
+        </w:rPr>
+        <w:t xml:space="preserve"> </w:t>
+      </w:r>
+      <w:r>
+        <w:rPr>
+          <w:rFonts w:ascii="Calibri" w:cs="Calibri" w:eastAsia="Calibri" w:hAnsi="Calibri"/>
+          <w:color w:val="242424"/>
+          <w:sz w:val="20"/>
+          <w:szCs w:val="20"/>
           <w:rtl w:val="0"/>
         </w:rPr>
         <w:t xml:space="preserve">[[EXP_1_LOCATION]]– [[EXP_1_DATES]]</w:t>
@@ -533,6 +576,8 @@
           <w:rFonts w:ascii="Calibri" w:cs="Calibri" w:eastAsia="Calibri" w:hAnsi="Calibri"/>
           <w:b w:val="1"/>
           <w:bCs w:val="1"/>
+          <w:sz w:val="20"/>
+          <w:szCs w:val="20"/>
         </w:rPr>
       </w:pPr>
       <w:r>
@@ -552,6 +597,8 @@
           <w:rFonts w:ascii="Calibri" w:cs="Calibri" w:eastAsia="Calibri" w:hAnsi="Calibri"/>
           <w:b w:val="1"/>
           <w:bCs w:val="1"/>
+          <w:sz w:val="20"/>
+          <w:szCs w:val="20"/>
         </w:rPr>
       </w:pPr>
       <w:r>
@@ -568,6 +615,8 @@
           <w:rFonts w:ascii="Calibri" w:cs="Calibri" w:eastAsia="Calibri" w:hAnsi="Calibri"/>
           <w:b w:val="1"/>
           <w:bCs w:val="1"/>
+          <w:sz w:val="20"/>
+          <w:szCs w:val="20"/>
         </w:rPr>
         <w:sectPr>
           <w:type w:val="continuous"/>
@@ -583,6 +632,8 @@
       <w:r>
         <w:rPr>
           <w:rFonts w:ascii="Calibri" w:cs="Calibri" w:eastAsia="Calibri" w:hAnsi="Calibri"/>
+          <w:sz w:val="20"/>
+          <w:szCs w:val="20"/>
           <w:rtl w:val="0"/>
         </w:rPr>
         <w:br w:type="textWrapping"/>
@@ -612,9 +663,17 @@
       <w:r>
         <w:rPr>
           <w:rFonts w:ascii="Calibri" w:cs="Calibri" w:eastAsia="Calibri" w:hAnsi="Calibri"/>
+          <w:sz w:val="20"/>
+          <w:szCs w:val="20"/>
           <w:rtl w:val="0"/>
         </w:rPr>
         <w:t xml:space="preserve">[[EXP_1_BULLETS]]</w:t>
+      </w:r>
+      <w:r>
+        <w:rPr>
+          <w:rFonts w:ascii="Calibri" w:cs="Calibri" w:eastAsia="Calibri" w:hAnsi="Calibri"/>
+          <w:rtl w:val="0"/>
+        </w:rPr>
         <w:br w:type="textWrapping"/>
       </w:r>
     </w:p>
@@ -699,18 +758,27 @@
         <w:spacing w:before="10" w:lineRule="auto"/>
         <w:rPr>
           <w:rFonts w:ascii="Calibri" w:cs="Calibri" w:eastAsia="Calibri" w:hAnsi="Calibri"/>
+          <w:sz w:val="20"/>
+          <w:szCs w:val="20"/>
+        </w:rPr>
+      </w:pPr>
+      <w:r>
+        <w:rPr>
+          <w:rFonts w:ascii="Calibri" w:cs="Calibri" w:eastAsia="Calibri" w:hAnsi="Calibri"/>
           <w:sz w:val="23"/>
           <w:szCs w:val="23"/>
-        </w:rPr>
-      </w:pPr>
-      <w:r>
-        <w:rPr>
-          <w:rFonts w:ascii="Calibri" w:cs="Calibri" w:eastAsia="Calibri" w:hAnsi="Calibri"/>
-          <w:sz w:val="23"/>
-          <w:szCs w:val="23"/>
-          <w:rtl w:val="0"/>
-        </w:rPr>
-        <w:t xml:space="preserve">   [[EXP_2_LOCATION]] - [[EXP_2_DATES]]</w:t>
+          <w:rtl w:val="0"/>
+        </w:rPr>
+        <w:t xml:space="preserve">  </w:t>
+      </w:r>
+      <w:r>
+        <w:rPr>
+          <w:rFonts w:ascii="Calibri" w:cs="Calibri" w:eastAsia="Calibri" w:hAnsi="Calibri"/>
+          <w:sz w:val="20"/>
+          <w:szCs w:val="20"/>
+          <w:rtl w:val="0"/>
+        </w:rPr>
+        <w:t xml:space="preserve"> [[EXP_2_LOCATION]] - [[EXP_2_DATES]]</w:t>
       </w:r>
       <w:r>
         <w:rPr>
@@ -727,13 +795,17 @@
         <w:ind w:left="180" w:firstLine="0"/>
         <w:rPr>
           <w:rFonts w:ascii="Calibri" w:cs="Calibri" w:eastAsia="Calibri" w:hAnsi="Calibri"/>
-        </w:rPr>
-      </w:pPr>
-      <w:r>
-        <w:rPr>
-          <w:rFonts w:ascii="Calibri" w:cs="Calibri" w:eastAsia="Calibri" w:hAnsi="Calibri"/>
-          <w:b w:val="1"/>
-          <w:bCs w:val="1"/>
+          <w:sz w:val="20"/>
+          <w:szCs w:val="20"/>
+        </w:rPr>
+      </w:pPr>
+      <w:r>
+        <w:rPr>
+          <w:rFonts w:ascii="Calibri" w:cs="Calibri" w:eastAsia="Calibri" w:hAnsi="Calibri"/>
+          <w:b w:val="1"/>
+          <w:bCs w:val="1"/>
+          <w:sz w:val="20"/>
+          <w:szCs w:val="20"/>
           <w:rtl w:val="0"/>
         </w:rPr>
         <w:tab/>
@@ -759,11 +831,15 @@
         <w:ind w:left="839" w:hanging="360"/>
         <w:rPr>
           <w:rFonts w:ascii="Calibri" w:cs="Calibri" w:eastAsia="Calibri" w:hAnsi="Calibri"/>
-        </w:rPr>
-      </w:pPr>
-      <w:r>
-        <w:rPr>
-          <w:rFonts w:ascii="Calibri" w:cs="Calibri" w:eastAsia="Calibri" w:hAnsi="Calibri"/>
+          <w:sz w:val="20"/>
+          <w:szCs w:val="20"/>
+        </w:rPr>
+      </w:pPr>
+      <w:r>
+        <w:rPr>
+          <w:rFonts w:ascii="Calibri" w:cs="Calibri" w:eastAsia="Calibri" w:hAnsi="Calibri"/>
+          <w:sz w:val="20"/>
+          <w:szCs w:val="20"/>
           <w:rtl w:val="0"/>
         </w:rPr>
         <w:t xml:space="preserve">[[EXP_2_BULLETS]]</w:t>
@@ -820,6 +896,8 @@
         <w:rPr>
           <w:rFonts w:ascii="Calibri" w:cs="Calibri" w:eastAsia="Calibri" w:hAnsi="Calibri"/>
           <w:color w:val="000000"/>
+          <w:sz w:val="20"/>
+          <w:szCs w:val="20"/>
         </w:rPr>
       </w:pPr>
       <w:r>
@@ -834,6 +912,8 @@
       <w:r>
         <w:rPr>
           <w:rFonts w:ascii="Calibri" w:cs="Calibri" w:eastAsia="Calibri" w:hAnsi="Calibri"/>
+          <w:sz w:val="20"/>
+          <w:szCs w:val="20"/>
           <w:rtl w:val="0"/>
         </w:rPr>
         <w:t xml:space="preserve">[[LEAD_1_LOCATION]] - [[LEAD_1_DATES]]</w:t>
@@ -843,6 +923,8 @@
           <w:rFonts w:ascii="Calibri" w:cs="Calibri" w:eastAsia="Calibri" w:hAnsi="Calibri"/>
           <w:b w:val="1"/>
           <w:bCs w:val="1"/>
+          <w:sz w:val="20"/>
+          <w:szCs w:val="20"/>
           <w:rtl w:val="0"/>
         </w:rPr>
         <w:br w:type="textWrapping"/>
@@ -875,11 +957,15 @@
         <w:rPr>
           <w:rFonts w:ascii="Calibri" w:cs="Calibri" w:eastAsia="Calibri" w:hAnsi="Calibri"/>
           <w:color w:val="000000"/>
-        </w:rPr>
-      </w:pPr>
-      <w:r>
-        <w:rPr>
-          <w:rFonts w:ascii="Calibri" w:cs="Calibri" w:eastAsia="Calibri" w:hAnsi="Calibri"/>
+          <w:sz w:val="20"/>
+          <w:szCs w:val="20"/>
+        </w:rPr>
+      </w:pPr>
+      <w:r>
+        <w:rPr>
+          <w:rFonts w:ascii="Calibri" w:cs="Calibri" w:eastAsia="Calibri" w:hAnsi="Calibri"/>
+          <w:sz w:val="20"/>
+          <w:szCs w:val="20"/>
           <w:rtl w:val="0"/>
         </w:rPr>
         <w:t xml:space="preserve">[[LEAD_1_BULLETS]]</w:t>
@@ -960,13 +1046,17 @@
         <w:ind w:left="180" w:firstLine="0"/>
         <w:rPr>
           <w:rFonts w:ascii="Calibri" w:cs="Calibri" w:eastAsia="Calibri" w:hAnsi="Calibri"/>
-        </w:rPr>
-      </w:pPr>
-      <w:r>
-        <w:rPr>
-          <w:rFonts w:ascii="Calibri" w:cs="Calibri" w:eastAsia="Calibri" w:hAnsi="Calibri"/>
-          <w:b w:val="1"/>
-          <w:bCs w:val="1"/>
+          <w:sz w:val="20"/>
+          <w:szCs w:val="20"/>
+        </w:rPr>
+      </w:pPr>
+      <w:r>
+        <w:rPr>
+          <w:rFonts w:ascii="Calibri" w:cs="Calibri" w:eastAsia="Calibri" w:hAnsi="Calibri"/>
+          <w:b w:val="1"/>
+          <w:bCs w:val="1"/>
+          <w:sz w:val="20"/>
+          <w:szCs w:val="20"/>
           <w:rtl w:val="0"/>
         </w:rPr>
         <w:t xml:space="preserve">Compétences techniques : </w:t>
@@ -974,6 +1064,8 @@
       <w:r>
         <w:rPr>
           <w:rFonts w:ascii="Calibri" w:cs="Calibri" w:eastAsia="Calibri" w:hAnsi="Calibri"/>
+          <w:sz w:val="20"/>
+          <w:szCs w:val="20"/>
           <w:rtl w:val="0"/>
         </w:rPr>
         <w:t xml:space="preserve">[[TECHNICAL_SKILLS]]                           </w:t>
@@ -992,13 +1084,17 @@
         <w:ind w:left="180" w:firstLine="0"/>
         <w:rPr>
           <w:rFonts w:ascii="Calibri" w:cs="Calibri" w:eastAsia="Calibri" w:hAnsi="Calibri"/>
-        </w:rPr>
-      </w:pPr>
-      <w:r>
-        <w:rPr>
-          <w:rFonts w:ascii="Calibri" w:cs="Calibri" w:eastAsia="Calibri" w:hAnsi="Calibri"/>
-          <w:b w:val="1"/>
-          <w:bCs w:val="1"/>
+          <w:sz w:val="20"/>
+          <w:szCs w:val="20"/>
+        </w:rPr>
+      </w:pPr>
+      <w:r>
+        <w:rPr>
+          <w:rFonts w:ascii="Calibri" w:cs="Calibri" w:eastAsia="Calibri" w:hAnsi="Calibri"/>
+          <w:b w:val="1"/>
+          <w:bCs w:val="1"/>
+          <w:sz w:val="20"/>
+          <w:szCs w:val="20"/>
           <w:rtl w:val="0"/>
         </w:rPr>
         <w:t xml:space="preserve">Intérêts : </w:t>
@@ -1006,6 +1102,8 @@
       <w:r>
         <w:rPr>
           <w:rFonts w:ascii="Calibri" w:cs="Calibri" w:eastAsia="Calibri" w:hAnsi="Calibri"/>
+          <w:sz w:val="20"/>
+          <w:szCs w:val="20"/>
           <w:rtl w:val="0"/>
         </w:rPr>
         <w:t xml:space="preserve">Parfumerie, Nouvelles Technologies, Sport , solo-trips (Amérique Latine, Asie, Europe)</w:t>
@@ -1024,6 +1122,8 @@
         <w:ind w:left="180" w:firstLine="0"/>
         <w:rPr>
           <w:rFonts w:ascii="Calibri" w:cs="Calibri" w:eastAsia="Calibri" w:hAnsi="Calibri"/>
+          <w:sz w:val="20"/>
+          <w:szCs w:val="20"/>
         </w:rPr>
       </w:pPr>
       <w:r>
@@ -1032,6 +1132,8 @@
           <w:b w:val="1"/>
           <w:bCs w:val="1"/>
           <w:color w:val="000000"/>
+          <w:sz w:val="20"/>
+          <w:szCs w:val="20"/>
           <w:rtl w:val="0"/>
         </w:rPr>
         <w:t xml:space="preserve">Langues : </w:t>
@@ -1039,6 +1141,8 @@
       <w:r>
         <w:rPr>
           <w:rFonts w:ascii="Calibri" w:cs="Calibri" w:eastAsia="Calibri" w:hAnsi="Calibri"/>
+          <w:sz w:val="20"/>
+          <w:szCs w:val="20"/>
           <w:rtl w:val="0"/>
         </w:rPr>
         <w:t xml:space="preserve">Français, Anglais (niveau C1 : autonome)</w:t>

</xml_diff>